<commit_message>
Aquatos-Web-LTX: DE aktualisiert, EN/NL/Quickstart/QuickReference ergänzt
</commit_message>
<xml_diff>
--- a/Aquatos-Web-LTX/TerraTransfer_Aquatos-Web-LTX_Bedienungsanleitung_DE.docx
+++ b/Aquatos-Web-LTX/TerraTransfer_Aquatos-Web-LTX_Bedienungsanleitung_DE.docx
@@ -15,7 +15,7 @@
           <wp:inline distT="0" distB="0" distL="0" distR="0">
             <wp:extent cx="4000500" cy="552450"/>
             <wp:effectExtent l="0" t="0" r="0" b="0"/>
-            <wp:docPr id="1" name="logo" descr="TerraTransfer&#10;TerraTransfer Logo"/>
+            <wp:docPr id="1" name="logo" descr="TerraTransfer TerraTransfer Logo"/>
             <wp:cNvGraphicFramePr>
               <a:graphicFrameLocks xmlns:a="http://schemas.openxmlformats.org/drawingml/2006/main" noChangeAspect="1"/>
             </wp:cNvGraphicFramePr>
@@ -23,7 +23,7 @@
               <a:graphicData uri="http://schemas.openxmlformats.org/drawingml/2006/picture">
                 <pic:pic xmlns:pic="http://schemas.openxmlformats.org/drawingml/2006/picture">
                   <pic:nvPicPr>
-                    <pic:cNvPr id="1" name="logo" descr="TerraTransfer&#10;TerraTransfer Logo"/>
+                    <pic:cNvPr id="1" name="logo" descr="TerraTransfer TerraTransfer Logo"/>
                     <pic:cNvPicPr>
                       <a:picLocks noChangeAspect="1" noChangeArrowheads="1"/>
                     </pic:cNvPicPr>
@@ -267,11 +267,6 @@
               <w:rStyle w:val="IndexLink"/>
             </w:rPr>
             <w:instrText xml:space="preserve"> TOC \o "1-3" \h</w:instrText>
-          </w:r>
-          <w:r>
-            <w:rPr>
-              <w:rStyle w:val="IndexLink"/>
-            </w:rPr>
             <w:fldChar w:fldCharType="separate"/>
           </w:r>
           <w:hyperlink w:anchor="__RefHeading___Toc528_3164825987" w:tooltip="Inhaltsverzeichnis">
@@ -2152,7 +2147,7 @@
           <w:sz w:val="22"/>
           <w:szCs w:val="22"/>
         </w:rPr>
-        <w:t>Vor dem Zusammenbau sind Dichtungen und Dichtflächen zu prüfen und zu fetten (Silikonfett oder O-Ring-Fett).</w:t>
+        <w:t>Vor dem Zusammenbau sind Dichtungen und Dichtflächen zu prüfen. Sind die O-Ringe noch ausreichend gefettet, ist keine Nachfettung erforderlich; andernfalls mit geeignetem Silikon- bzw. O-Ring-Fett (z. B. Korasilon Paste hochviskos) nachfetten.</w:t>
       </w:r>
     </w:p>
     <w:p>
@@ -2196,7 +2191,7 @@
           <w:sz w:val="22"/>
           <w:szCs w:val="22"/>
         </w:rPr>
-        <w:t>Das Trockenmittel (Silikagel) ist bei Bedarf zu ersetzen. Der Trockenmittelbeutel befindet sich am Deckel der Elektronikeinheit.</w:t>
+        <w:t>Das Trockenmittel (Silikagel) ist bei Bedarf zu ersetzen. Die Trockenmittelbeutel befinden sich im Inneren unter der oberen Metallhülse: Lösen Sie hierzu die Kopfverschraubung (Antennenseite) und schieben Sie die Hülse vom Kunststoff-Sensorkörper ab.</w:t>
       </w:r>
     </w:p>
     <w:p>
@@ -2225,7 +2220,7 @@
           <w:sz w:val="22"/>
           <w:szCs w:val="22"/>
         </w:rPr>
-        <w:t>Kontrollieren Sie bei jedem Zusammenbau die O-Ring-Dichtung; beschädigte Dichtungen müssen ersetzt werden. Richtwerte für die Luftfeuchte im Gehäuse: bis 50 % unbedenklich, ab 70 % sollte der Wert beobachtet werden, spätestens bei über 85 % sind die Trockenmittel-Päckchen zu wechseln. Die meisten Trockenmittel lassen sich durch Trocknung bei 120 °C bis 150 °C für 20 Minuten regenerieren.</w:t>
+        <w:t>Kontrollieren Sie bei jedem Zusammenbau die O-Ring-Dichtung; beschädigte Dichtungen müssen ersetzt werden. Richtwerte für die Luftfeuchte im Gehäuse: bis 50 % unbedenklich, ab 70 % sollten die Trockenmittel-Päckchen zeitnah gewechselt werden, ab 85 % ist die Feuchte zu hoch. Ersatz-Trockenmittel sind bei TerraTransfer erhältlich; alternativ lassen sich die meisten Trockenmittel durch Trocknung bei 120 °C bis 150 °C für ca. 20 Minuten regenerieren.</w:t>
       </w:r>
     </w:p>
     <w:p>
@@ -2326,21 +2321,6 @@
           <w:szCs w:val="22"/>
         </w:rPr>
         <w:t>Das Gerät verfügt über einen Standard-FME-Stecker. Stellen Sie sicher, dass die Antenne vollständig angeschlossen ist, und richten Sie sie gegebenenfalls leicht aus, um das beste Signal zu erhalten.</w:t>
-      </w:r>
-    </w:p>
-    <w:p>
-      <w:pPr>
-        <w:pStyle w:val="Normal"/>
-        <w:spacing w:lineRule="auto" w:line="300" w:before="60" w:after="120"/>
-        <w:jc w:val="both"/>
-        <w:rPr/>
-      </w:pPr>
-      <w:r>
-        <w:rPr>
-          <w:sz w:val="22"/>
-          <w:szCs w:val="22"/>
-        </w:rPr>
-        <w:t>In Bereichen mit schwacher Netzabdeckung können Hochleistungsantennen (unter Beachtung der lokalen Vorschriften) oder Richtantennen eingesetzt werden. Die Antennen sollten auf Basis ihrer Einsatzumgebung ausgewählt werden – sprechen Sie uns an, damit wir eine geeignete Antenne für Ihren Messort ermitteln.</w:t>
       </w:r>
     </w:p>
     <w:p>
@@ -2369,7 +2349,7 @@
           <w:sz w:val="22"/>
           <w:szCs w:val="22"/>
         </w:rPr>
-        <w:t>Wir empfehlen dringend einen Ortsbesuch, um Qualität und Stabilität der Netzabdeckung in Höhe der Antenne zu beurteilen. Bei instabiler oder schwacher Abdeckung kann der Logger durch wiederholte Verbindungsversuche mehr Energie verbrauchen als nötig. Eine übliche Lösung ist es, die Antenne höher zu positionieren. Hochgewinnantennen sind möglich, müssen jedoch den nationalen bzw. regionalen Vorschriften entsprechen; die zulässige Antennenverstärkung ist abhängig vom Frequenzbereich – beachten Sie die Regelungen für 4G/5G LTE Cat M.</w:t>
+        <w:t>Wir empfehlen dringend einen Ortsbesuch, um Qualität und Stabilität der Netzabdeckung in Höhe der Antenne zu beurteilen. Bei instabiler oder schwacher Abdeckung kann der Logger durch wiederholte Verbindungsversuche mehr Energie verbrauchen als nötig. Eine übliche Lösung ist es, die Antenne höher zu positionieren – sprechen Sie uns an, wenn Sie Unterstützung bei der Antennenauswahl für Ihren Messort benötigen.</w:t>
       </w:r>
     </w:p>
     <w:p>
@@ -2404,7 +2384,7 @@
           <w:sz w:val="22"/>
           <w:szCs w:val="22"/>
         </w:rPr>
-        <w:t>Der Aquatos Web LTX verfügt über einen Push-Pull-SIM-Karten-Halter (auch Friction-Fit-Halter genannt).</w:t>
+        <w:t>Der Aquatos Web LTX verwendet eine Nano-SIM. Der SIM-Karten-Halter (Push-Pull / Friction-Fit) sitzt seitlich am Kunststoff-Sensorkörper, unter der oberen Metallhülse.</w:t>
       </w:r>
     </w:p>
     <w:p>
@@ -2419,7 +2399,7 @@
           <w:sz w:val="22"/>
           <w:szCs w:val="22"/>
         </w:rPr>
-        <w:t>Um auf den SIM-Karten-Halter zuzugreifen, entfernen Sie die obere Hälfte der Metallhülse. Diese wird durch den abnehmbaren Kopfdeckel gehalten, der den Antennenanschluss schützt und einen Ankerring für die 2"-Rohrbefestigung bildet. Lösen Sie den Kopfdeckel und schieben Sie die Metallhülse ab. Drehen Sie den geöffneten Logger so, dass der Push-Pull-SIM-Karten-Halter auf dem Kunststoff-Sensorkörper liegt. Schieben Sie die SIM-Karte nun in den Halter. Zum Entnehmen der SIM drücken Sie leicht auf die Karte; die SIM kann anschließend aus dem Halter gezogen werden.</w:t>
+        <w:t>Um auf den SIM-Karten-Halter zuzugreifen, lösen Sie die Kopfverschraubung (Antennenseite) – der Kopfdeckel schützt den Antennenanschluss und bildet zugleich den Ankerring für die 2"-Rohrbefestigung. Schieben Sie die obere Metallhülse vom Kunststoff-Sensorkörper ab. Drehen Sie den geöffneten Logger so, dass die seitliche Aussparung mit dem Push-Pull-Halter sichtbar ist. Schieben Sie die Nano-SIM in den Halter ein. Zum Entnehmen drücken Sie leicht auf die Karte; sie kann anschließend aus dem Halter herausgezogen werden.</w:t>
       </w:r>
     </w:p>
     <w:p>
@@ -2435,7 +2415,7 @@
           <wp:inline distT="0" distB="0" distL="0" distR="0">
             <wp:extent cx="4191000" cy="1333500"/>
             <wp:effectExtent l="0" t="0" r="0" b="0"/>
-            <wp:docPr id="2" name="photo" descr="Aquatos Web LTX&#10;Produktfoto"/>
+            <wp:docPr id="2" name="photo" descr="Aquatos Web LTX Produktfoto"/>
             <wp:cNvGraphicFramePr>
               <a:graphicFrameLocks xmlns:a="http://schemas.openxmlformats.org/drawingml/2006/main" noChangeAspect="1"/>
             </wp:cNvGraphicFramePr>
@@ -2443,7 +2423,7 @@
               <a:graphicData uri="http://schemas.openxmlformats.org/drawingml/2006/picture">
                 <pic:pic xmlns:pic="http://schemas.openxmlformats.org/drawingml/2006/picture">
                   <pic:nvPicPr>
-                    <pic:cNvPr id="2" name="photo" descr="Aquatos Web LTX&#10;Produktfoto"/>
+                    <pic:cNvPr id="2" name="photo" descr="Aquatos Web LTX Produktfoto"/>
                     <pic:cNvPicPr>
                       <a:picLocks noChangeAspect="1" noChangeArrowheads="1"/>
                     </pic:cNvPicPr>
@@ -2473,39 +2453,6 @@
     </w:p>
     <w:p>
       <w:pPr>
-        <w:pStyle w:val="Normal"/>
-        <w:spacing w:before="160" w:after="60"/>
-        <w:rPr/>
-      </w:pPr>
-      <w:r>
-        <w:rPr>
-          <w:rFonts w:eastAsia="Arial" w:cs="Arial" w:ascii="Arial" w:hAnsi="Arial"/>
-          <w:b/>
-          <w:bCs/>
-          <w:color w:val="2D3436"/>
-          <w:sz w:val="22"/>
-          <w:szCs w:val="22"/>
-        </w:rPr>
-        <w:t>Modelle mit Lieferdatum vor 2024</w:t>
-      </w:r>
-    </w:p>
-    <w:p>
-      <w:pPr>
-        <w:pStyle w:val="Normal"/>
-        <w:spacing w:lineRule="auto" w:line="300" w:before="60" w:after="120"/>
-        <w:jc w:val="both"/>
-        <w:rPr/>
-      </w:pPr>
-      <w:r>
-        <w:rPr>
-          <w:sz w:val="22"/>
-          <w:szCs w:val="22"/>
-        </w:rPr>
-        <w:t>Ältere Geräte verwenden einen SIM-Halter mit Rastmechanismus, also einem Schieber, der die SIM in definierter Position hält. Diese Top-Loader-SIM-Halter sitzen am selben Ort, jedoch in einer größeren Aussparung, die direkten Zugriff auf den Halter erlaubt. Zum Öffnen drücken Sie den Schieber leicht in Richtung der Markierung „Push Open". Der Schieber rastet aus. Zum Schließen wiederholen Sie den Vorgang in entgegengesetzter Richtung, bis der Schieber wieder einrastet.</w:t>
-      </w:r>
-    </w:p>
-    <w:p>
-      <w:pPr>
         <w:pStyle w:val="Heading2"/>
         <w:spacing w:before="360" w:after="160"/>
         <w:rPr/>
@@ -2536,7 +2483,7 @@
           <w:sz w:val="22"/>
           <w:szCs w:val="22"/>
         </w:rPr>
-        <w:t>Das Batteriefach befindet sich in der unteren Hälfte des Sensors. Für den Zugriff wird die untere Metallhülse entfernt. Diese wird mit einem Ringkappe-Verschluss gehalten; durch Lösen der Kappe lässt sich die Metallhülse vom Kunststoff-Sensorkörper abziehen.</w:t>
+        <w:t>Das Batteriefach befindet sich unter der unteren Metallhülse. Lösen Sie hierzu die Fußverschraubung (Sensor-Seite) und schieben Sie die untere Metallhülse vom Kunststoff-Sensorkörper ab.</w:t>
       </w:r>
     </w:p>
     <w:p>
@@ -2658,7 +2605,7 @@
           <w:sz w:val="22"/>
           <w:szCs w:val="22"/>
         </w:rPr>
-        <w:t>Die Elektronik verfügt über einen Stützkondensator, der kurze Unterbrechungen der Stromversorgung (z. B. während eines Batteriewechsels) überbrückt. Datum und Uhrzeit bleiben dabei erhalten. Dauert die Unterbrechung zu lange, führt der Logger einen Neustart durch. Dies erkennen Sie an ca. zehn Blinkimpulsen der grünen LED. Das Gerät ist anschließend einsatzbereit; die Systemzeit muss jedoch neu synchronisiert werden.</w:t>
+        <w:t>Die Elektronik verfügt über einen Stützkondensator, der kurze Unterbrechungen der Stromversorgung (z. B. während eines Batteriewechsels) überbrückt. Datum und Uhrzeit bleiben dabei erhalten. Dauert die Unterbrechung zu lange, führt der Logger einen Neustart durch. Dies erkennen Sie an ca. zehn Blinkimpulsen der grünen LED. Das Gerät ist anschließend einsatzbereit; die Systemzeit wird mit der nächsten Datenübertragung über das Mobilfunknetz automatisch synchronisiert. Soll die Synchronisation nicht bis zur nächsten automatischen Übertragung warten, können Sie eine Übertragung vor Ort manuell auslösen.</w:t>
       </w:r>
     </w:p>
     <w:p>
@@ -2674,7 +2621,7 @@
           <wp:inline distT="0" distB="0" distL="0" distR="0">
             <wp:extent cx="5143500" cy="1762125"/>
             <wp:effectExtent l="0" t="0" r="0" b="0"/>
-            <wp:docPr id="3" name="Image2" descr="Aquatos Web LTX&#10;Produktfoto"/>
+            <wp:docPr id="3" name="Image2" descr="Aquatos Web LTX Produktfoto"/>
             <wp:cNvGraphicFramePr>
               <a:graphicFrameLocks xmlns:a="http://schemas.openxmlformats.org/drawingml/2006/main" noChangeAspect="1"/>
             </wp:cNvGraphicFramePr>
@@ -2682,7 +2629,7 @@
               <a:graphicData uri="http://schemas.openxmlformats.org/drawingml/2006/picture">
                 <pic:pic xmlns:pic="http://schemas.openxmlformats.org/drawingml/2006/picture">
                   <pic:nvPicPr>
-                    <pic:cNvPr id="3" name="Image2" descr="Aquatos Web LTX&#10;Produktfoto"/>
+                    <pic:cNvPr id="3" name="Image2" descr="Aquatos Web LTX Produktfoto"/>
                     <pic:cNvPicPr>
                       <a:picLocks noChangeAspect="1" noChangeArrowheads="1"/>
                     </pic:cNvPicPr>
@@ -3054,7 +3001,7 @@
           <wp:inline distT="0" distB="0" distL="0" distR="0">
             <wp:extent cx="5143500" cy="2286000"/>
             <wp:effectExtent l="0" t="0" r="0" b="0"/>
-            <wp:docPr id="4" name="Image3" descr="Aquatos Web LTX&#10;Produktfoto"/>
+            <wp:docPr id="4" name="Image3" descr="Aquatos Web LTX Produktfoto"/>
             <wp:cNvGraphicFramePr>
               <a:graphicFrameLocks xmlns:a="http://schemas.openxmlformats.org/drawingml/2006/main" noChangeAspect="1"/>
             </wp:cNvGraphicFramePr>
@@ -3062,7 +3009,7 @@
               <a:graphicData uri="http://schemas.openxmlformats.org/drawingml/2006/picture">
                 <pic:pic xmlns:pic="http://schemas.openxmlformats.org/drawingml/2006/picture">
                   <pic:nvPicPr>
-                    <pic:cNvPr id="4" name="Image3" descr="Aquatos Web LTX&#10;Produktfoto"/>
+                    <pic:cNvPr id="4" name="Image3" descr="Aquatos Web LTX Produktfoto"/>
                     <pic:cNvPicPr>
                       <a:picLocks noChangeAspect="1" noChangeArrowheads="1"/>
                     </pic:cNvPicPr>
@@ -3201,7 +3148,7 @@
           <w:sz w:val="22"/>
           <w:szCs w:val="22"/>
         </w:rPr>
-        <w:t>Geben Sie die Bluetooth-PIN des Loggers ein. Die PIN wird anschließend auf dem PC gespeichert, um künftige Verbindungen zu beschleunigen.</w:t>
+        <w:t>Jeder Datenlogger besitzt eine eigene 6-stellige Bluetooth-PIN. Geben Sie diese PIN ein. Sie wird anschließend auf dem Endgerät (PC, Tablet oder Smartphone) gespeichert, sodass Sie sie dort bei weiteren Verbindungen nicht erneut eingeben müssen. Bei Nutzung eines anderen Endgeräts muss die PIN dort einmalig neu eingegeben werden.</w:t>
       </w:r>
     </w:p>
     <w:p>
@@ -3279,7 +3226,7 @@
           <wp:inline distT="0" distB="0" distL="0" distR="0">
             <wp:extent cx="5143500" cy="2476500"/>
             <wp:effectExtent l="0" t="0" r="0" b="0"/>
-            <wp:docPr id="5" name="Image4" descr="Aquatos Web LTX&#10;Produktfoto"/>
+            <wp:docPr id="5" name="Image4" descr="Aquatos Web LTX Produktfoto"/>
             <wp:cNvGraphicFramePr>
               <a:graphicFrameLocks xmlns:a="http://schemas.openxmlformats.org/drawingml/2006/main" noChangeAspect="1"/>
             </wp:cNvGraphicFramePr>
@@ -3287,7 +3234,7 @@
               <a:graphicData uri="http://schemas.openxmlformats.org/drawingml/2006/picture">
                 <pic:pic xmlns:pic="http://schemas.openxmlformats.org/drawingml/2006/picture">
                   <pic:nvPicPr>
-                    <pic:cNvPr id="5" name="Image4" descr="Aquatos Web LTX&#10;Produktfoto"/>
+                    <pic:cNvPr id="5" name="Image4" descr="Aquatos Web LTX Produktfoto"/>
                     <pic:cNvPicPr>
                       <a:picLocks noChangeAspect="1" noChangeArrowheads="1"/>
                     </pic:cNvPicPr>
@@ -3623,7 +3570,7 @@
           <wp:inline distT="0" distB="0" distL="0" distR="0">
             <wp:extent cx="5143500" cy="3286125"/>
             <wp:effectExtent l="0" t="0" r="0" b="0"/>
-            <wp:docPr id="6" name="Image5" descr="Aquatos Web LTX&#10;Produktfoto"/>
+            <wp:docPr id="6" name="Image5" descr="Aquatos Web LTX Produktfoto"/>
             <wp:cNvGraphicFramePr>
               <a:graphicFrameLocks xmlns:a="http://schemas.openxmlformats.org/drawingml/2006/main" noChangeAspect="1"/>
             </wp:cNvGraphicFramePr>
@@ -3631,7 +3578,7 @@
               <a:graphicData uri="http://schemas.openxmlformats.org/drawingml/2006/picture">
                 <pic:pic xmlns:pic="http://schemas.openxmlformats.org/drawingml/2006/picture">
                   <pic:nvPicPr>
-                    <pic:cNvPr id="6" name="Image5" descr="Aquatos Web LTX&#10;Produktfoto"/>
+                    <pic:cNvPr id="6" name="Image5" descr="Aquatos Web LTX Produktfoto"/>
                     <pic:cNvPicPr>
                       <a:picLocks noChangeAspect="1" noChangeArrowheads="1"/>
                     </pic:cNvPicPr>
@@ -3878,10 +3825,24 @@
     <w:p>
       <w:pPr>
         <w:pStyle w:val="Normal"/>
-        <w:spacing w:lineRule="auto" w:line="300" w:before="60" w:after="120"/>
-        <w:jc w:val="both"/>
-        <w:rPr/>
-      </w:pPr>
+        <w:pBdr>
+          <w:left w:val="single" w:sz="16" w:space="8" w:color="D97706"/>
+        </w:pBdr>
+        <w:shd w:val="clear" w:fill="FFF4E5"/>
+        <w:spacing w:lineRule="auto" w:line="281" w:before="140" w:after="140"/>
+        <w:ind w:left="220"/>
+        <w:rPr/>
+      </w:pPr>
+      <w:r>
+        <w:rPr>
+          <w:b/>
+          <w:bCs/>
+          <w:color w:val="B45309"/>
+          <w:sz w:val="22"/>
+          <w:szCs w:val="22"/>
+        </w:rPr>
+        <w:t xml:space="preserve">Wichtig – falls noch nicht aktiviert: </w:t>
+      </w:r>
       <w:r>
         <w:rPr>
           <w:sz w:val="22"/>
@@ -4070,7 +4031,7 @@
           <wp:inline distT="0" distB="0" distL="0" distR="0">
             <wp:extent cx="4762500" cy="2857500"/>
             <wp:effectExtent l="0" t="0" r="0" b="0"/>
-            <wp:docPr id="7" name="Image6" descr="Aquatos Web LTX&#10;Produktfoto"/>
+            <wp:docPr id="7" name="Image6" descr="Aquatos Web LTX Produktfoto"/>
             <wp:cNvGraphicFramePr>
               <a:graphicFrameLocks xmlns:a="http://schemas.openxmlformats.org/drawingml/2006/main" noChangeAspect="1"/>
             </wp:cNvGraphicFramePr>
@@ -4078,7 +4039,7 @@
               <a:graphicData uri="http://schemas.openxmlformats.org/drawingml/2006/picture">
                 <pic:pic xmlns:pic="http://schemas.openxmlformats.org/drawingml/2006/picture">
                   <pic:nvPicPr>
-                    <pic:cNvPr id="7" name="Image6" descr="Aquatos Web LTX&#10;Produktfoto"/>
+                    <pic:cNvPr id="7" name="Image6" descr="Aquatos Web LTX Produktfoto"/>
                     <pic:cNvPicPr>
                       <a:picLocks noChangeAspect="1" noChangeArrowheads="1"/>
                     </pic:cNvPicPr>
@@ -4337,7 +4298,7 @@
           <wp:inline distT="0" distB="0" distL="0" distR="0">
             <wp:extent cx="5143500" cy="2952750"/>
             <wp:effectExtent l="0" t="0" r="0" b="0"/>
-            <wp:docPr id="8" name="Image7" descr="Aquatos Web LTX&#10;Produktfoto"/>
+            <wp:docPr id="8" name="Image7" descr="Aquatos Web LTX Produktfoto"/>
             <wp:cNvGraphicFramePr>
               <a:graphicFrameLocks xmlns:a="http://schemas.openxmlformats.org/drawingml/2006/main" noChangeAspect="1"/>
             </wp:cNvGraphicFramePr>
@@ -4345,7 +4306,7 @@
               <a:graphicData uri="http://schemas.openxmlformats.org/drawingml/2006/picture">
                 <pic:pic xmlns:pic="http://schemas.openxmlformats.org/drawingml/2006/picture">
                   <pic:nvPicPr>
-                    <pic:cNvPr id="8" name="Image7" descr="Aquatos Web LTX&#10;Produktfoto"/>
+                    <pic:cNvPr id="8" name="Image7" descr="Aquatos Web LTX Produktfoto"/>
                     <pic:cNvPicPr>
                       <a:picLocks noChangeAspect="1" noChangeArrowheads="1"/>
                     </pic:cNvPicPr>
@@ -4500,7 +4461,7 @@
           <wp:inline distT="0" distB="0" distL="0" distR="0">
             <wp:extent cx="4000500" cy="2714625"/>
             <wp:effectExtent l="0" t="0" r="0" b="0"/>
-            <wp:docPr id="9" name="Image8" descr="Aquatos Web LTX&#10;Produktfoto"/>
+            <wp:docPr id="9" name="Image8" descr="Aquatos Web LTX Produktfoto"/>
             <wp:cNvGraphicFramePr>
               <a:graphicFrameLocks xmlns:a="http://schemas.openxmlformats.org/drawingml/2006/main" noChangeAspect="1"/>
             </wp:cNvGraphicFramePr>
@@ -4508,7 +4469,7 @@
               <a:graphicData uri="http://schemas.openxmlformats.org/drawingml/2006/picture">
                 <pic:pic xmlns:pic="http://schemas.openxmlformats.org/drawingml/2006/picture">
                   <pic:nvPicPr>
-                    <pic:cNvPr id="9" name="Image8" descr="Aquatos Web LTX&#10;Produktfoto"/>
+                    <pic:cNvPr id="9" name="Image8" descr="Aquatos Web LTX Produktfoto"/>
                     <pic:cNvPicPr>
                       <a:picLocks noChangeAspect="1" noChangeArrowheads="1"/>
                     </pic:cNvPicPr>
@@ -4833,7 +4794,7 @@
           <wp:inline distT="0" distB="0" distL="0" distR="0">
             <wp:extent cx="5143500" cy="2381250"/>
             <wp:effectExtent l="0" t="0" r="0" b="0"/>
-            <wp:docPr id="10" name="Image9" descr="Aquatos Web LTX&#10;Produktfoto"/>
+            <wp:docPr id="10" name="Image9" descr="Aquatos Web LTX Produktfoto"/>
             <wp:cNvGraphicFramePr>
               <a:graphicFrameLocks xmlns:a="http://schemas.openxmlformats.org/drawingml/2006/main" noChangeAspect="1"/>
             </wp:cNvGraphicFramePr>
@@ -4841,7 +4802,7 @@
               <a:graphicData uri="http://schemas.openxmlformats.org/drawingml/2006/picture">
                 <pic:pic xmlns:pic="http://schemas.openxmlformats.org/drawingml/2006/picture">
                   <pic:nvPicPr>
-                    <pic:cNvPr id="10" name="Image9" descr="Aquatos Web LTX&#10;Produktfoto"/>
+                    <pic:cNvPr id="10" name="Image9" descr="Aquatos Web LTX Produktfoto"/>
                     <pic:cNvPicPr>
                       <a:picLocks noChangeAspect="1" noChangeArrowheads="1"/>
                     </pic:cNvPicPr>
@@ -4989,7 +4950,7 @@
           <wp:inline distT="0" distB="0" distL="0" distR="0">
             <wp:extent cx="4000500" cy="2095500"/>
             <wp:effectExtent l="0" t="0" r="0" b="0"/>
-            <wp:docPr id="11" name="Image10" descr="Aquatos Web LTX&#10;Produktfoto"/>
+            <wp:docPr id="11" name="Image10" descr="Aquatos Web LTX Produktfoto"/>
             <wp:cNvGraphicFramePr>
               <a:graphicFrameLocks xmlns:a="http://schemas.openxmlformats.org/drawingml/2006/main" noChangeAspect="1"/>
             </wp:cNvGraphicFramePr>
@@ -4997,7 +4958,7 @@
               <a:graphicData uri="http://schemas.openxmlformats.org/drawingml/2006/picture">
                 <pic:pic xmlns:pic="http://schemas.openxmlformats.org/drawingml/2006/picture">
                   <pic:nvPicPr>
-                    <pic:cNvPr id="11" name="Image10" descr="Aquatos Web LTX&#10;Produktfoto"/>
+                    <pic:cNvPr id="11" name="Image10" descr="Aquatos Web LTX Produktfoto"/>
                     <pic:cNvPicPr>
                       <a:picLocks noChangeAspect="1" noChangeArrowheads="1"/>
                     </pic:cNvPicPr>
@@ -6056,7 +6017,7 @@
           <wp:inline distT="0" distB="0" distL="0" distR="0">
             <wp:extent cx="1714500" cy="1381125"/>
             <wp:effectExtent l="0" t="0" r="0" b="0"/>
-            <wp:docPr id="12" name="Image11" descr="Aquatos Web LTX&#10;Produktfoto"/>
+            <wp:docPr id="12" name="Image11" descr="Aquatos Web LTX Produktfoto"/>
             <wp:cNvGraphicFramePr>
               <a:graphicFrameLocks xmlns:a="http://schemas.openxmlformats.org/drawingml/2006/main" noChangeAspect="1"/>
             </wp:cNvGraphicFramePr>
@@ -6064,7 +6025,7 @@
               <a:graphicData uri="http://schemas.openxmlformats.org/drawingml/2006/picture">
                 <pic:pic xmlns:pic="http://schemas.openxmlformats.org/drawingml/2006/picture">
                   <pic:nvPicPr>
-                    <pic:cNvPr id="12" name="Image11" descr="Aquatos Web LTX&#10;Produktfoto"/>
+                    <pic:cNvPr id="12" name="Image11" descr="Aquatos Web LTX Produktfoto"/>
                     <pic:cNvPicPr>
                       <a:picLocks noChangeAspect="1" noChangeArrowheads="1"/>
                     </pic:cNvPicPr>
@@ -6480,7 +6441,7 @@
           <w:sz w:val="22"/>
           <w:szCs w:val="22"/>
         </w:rPr>
-        <w:t>Um die wasserdichte Abdichtung zu erhalten, sind die Dichtungen bei jedem Öffnen und Schließen des Loggers (Batteriewechsel, SIM-Karten-Tausch etc.) zu fetten. O-Ringe befinden sich an beiden Enden des Kunststoff-Sensorkörpers sowie in der Mitte, neben der Trennwand zwischen den beiden Körperhälften. Das folgende Bild zeigt die Dichtungen (schwarze O-Ringe) am unteren Ende des Sensorkörpers sowie zwei Dichtungen im mittleren Bereich.</w:t>
+        <w:t>Die Dichtungen sollten stets gut gefettet sein. Prüfen Sie bei jedem Öffnen des Loggers (Batteriewechsel, SIM-Karten-Tausch etc.), ob die O-Ringe noch ausreichend geschmiert sind – ist dies der Fall, ist keine Nachfettung erforderlich; andernfalls mit geeignetem Fett nachfetten. Verwenden Sie ausschließlich hochviskose Silikon-Pasten (z. B. Korasilon Paste hochviskos); ungeeignete Fette können die O-Ringe quellen lassen oder beschädigen. Der Aquatos Web LTX verfügt über insgesamt vier Dichtringe: zwei an den Enden des Kunststoff-Sensorkörpers sowie zwei in der Mitte neben der Trennwand zwischen den beiden Körperhälften. Das folgende Bild zeigt die Dichtungen (schwarze O-Ringe) am unteren Ende des Sensorkörpers sowie zwei Dichtungen im mittleren Bereich.</w:t>
       </w:r>
     </w:p>
     <w:p>
@@ -6496,7 +6457,7 @@
           <wp:inline distT="0" distB="0" distL="0" distR="0">
             <wp:extent cx="5143500" cy="1724025"/>
             <wp:effectExtent l="0" t="0" r="0" b="0"/>
-            <wp:docPr id="13" name="Image12" descr="Aquatos Web LTX&#10;Produktfoto"/>
+            <wp:docPr id="13" name="Image12" descr="Aquatos Web LTX Produktfoto"/>
             <wp:cNvGraphicFramePr>
               <a:graphicFrameLocks xmlns:a="http://schemas.openxmlformats.org/drawingml/2006/main" noChangeAspect="1"/>
             </wp:cNvGraphicFramePr>
@@ -6504,7 +6465,7 @@
               <a:graphicData uri="http://schemas.openxmlformats.org/drawingml/2006/picture">
                 <pic:pic xmlns:pic="http://schemas.openxmlformats.org/drawingml/2006/picture">
                   <pic:nvPicPr>
-                    <pic:cNvPr id="13" name="Image12" descr="Aquatos Web LTX&#10;Produktfoto"/>
+                    <pic:cNvPr id="13" name="Image12" descr="Aquatos Web LTX Produktfoto"/>
                     <pic:cNvPicPr>
                       <a:picLocks noChangeAspect="1" noChangeArrowheads="1"/>
                     </pic:cNvPicPr>
@@ -7711,15 +7672,7 @@
                 <w:sz w:val="22"/>
                 <w:szCs w:val="22"/>
               </w:rPr>
-              <w:t xml:space="preserve">• </w:t>
-            </w:r>
-            <w:r>
-              <w:rPr>
-                <w:color w:val="2D3436"/>
-                <w:sz w:val="22"/>
-                <w:szCs w:val="22"/>
-              </w:rPr>
-              <w:t>LTE-M (4G / LTE Cat M), bidirektional · Fallback auf NB-IoT (LTE-NB) und 2G / GSM</w:t>
+              <w:t>• LTE-M (4G / LTE Cat M), bidirektional · Fallback auf NB-IoT (LTE-NB) und 2G / GSM</w:t>
             </w:r>
           </w:p>
           <w:p>
@@ -7734,15 +7687,7 @@
                 <w:sz w:val="22"/>
                 <w:szCs w:val="22"/>
               </w:rPr>
-              <w:t xml:space="preserve">• </w:t>
-            </w:r>
-            <w:r>
-              <w:rPr>
-                <w:color w:val="2D3436"/>
-                <w:sz w:val="22"/>
-                <w:szCs w:val="22"/>
-              </w:rPr>
-              <w:t>Datenübertragung per HTTPS (TLS-verschlüsselt)</w:t>
+              <w:t>• Datenübertragung per HTTPS (TLS-verschlüsselt)</w:t>
             </w:r>
           </w:p>
           <w:p>
@@ -7757,15 +7702,7 @@
                 <w:sz w:val="22"/>
                 <w:szCs w:val="22"/>
               </w:rPr>
-              <w:t xml:space="preserve">• </w:t>
-            </w:r>
-            <w:r>
-              <w:rPr>
-                <w:color w:val="2D3436"/>
-                <w:sz w:val="22"/>
-                <w:szCs w:val="22"/>
-              </w:rPr>
-              <w:t>Direktanbindung an das Sensormanager-Webportal</w:t>
+              <w:t>• Direktanbindung an das Sensormanager-Webportal</w:t>
             </w:r>
           </w:p>
           <w:p>
@@ -9135,7 +9072,7 @@
         <wp:inline distT="0" distB="0" distL="0" distR="0">
           <wp:extent cx="1047750" cy="142875"/>
           <wp:effectExtent l="0" t="0" r="0" b="0"/>
-          <wp:docPr id="14" name="Image13" descr="TerraTransfer&#10;Logo"/>
+          <wp:docPr id="14" name="Image13" descr="TerraTransfer Logo"/>
           <wp:cNvGraphicFramePr>
             <a:graphicFrameLocks xmlns:a="http://schemas.openxmlformats.org/drawingml/2006/main" noChangeAspect="1"/>
           </wp:cNvGraphicFramePr>
@@ -9143,7 +9080,7 @@
             <a:graphicData uri="http://schemas.openxmlformats.org/drawingml/2006/picture">
               <pic:pic xmlns:pic="http://schemas.openxmlformats.org/drawingml/2006/picture">
                 <pic:nvPicPr>
-                  <pic:cNvPr id="14" name="Image13" descr="TerraTransfer&#10;Logo"/>
+                  <pic:cNvPr id="14" name="Image13" descr="TerraTransfer Logo"/>
                   <pic:cNvPicPr>
                     <a:picLocks noChangeAspect="1" noChangeArrowheads="1"/>
                   </pic:cNvPicPr>

</xml_diff>